<commit_message>
Epic 3 - Petro Hodii
</commit_message>
<xml_diff>
--- a/ai_11/petro_hodii/epic_3/epic_3_report_petro_hodii.docx
+++ b/ai_11/petro_hodii/epic_3/epic_3_report_petro_hodii.docx
@@ -983,7 +983,7 @@
       <w:hyperlink r:id="rId3" w:tgtFrame="_blank">
         <w:r>
           <w:rPr>
-            <w:rStyle w:val="ListLabel91"/>
+            <w:rStyle w:val="ListLabel1"/>
             <w:rFonts w:eastAsia="Times New Roman" w:cs="Times New Roman" w:ascii="Times New Roman" w:hAnsi="Times New Roman"/>
             <w:color w:val="0000FF"/>
             <w:sz w:val="28"/>
@@ -1005,7 +1005,7 @@
       <w:hyperlink r:id="rId4" w:tgtFrame="_blank">
         <w:r>
           <w:rPr>
-            <w:rStyle w:val="ListLabel91"/>
+            <w:rStyle w:val="ListLabel1"/>
             <w:rFonts w:eastAsia="Times New Roman" w:cs="Times New Roman" w:ascii="Times New Roman" w:hAnsi="Times New Roman"/>
             <w:color w:val="0000FF"/>
             <w:sz w:val="28"/>
@@ -1069,7 +1069,7 @@
       <w:hyperlink r:id="rId5" w:tgtFrame="_blank">
         <w:r>
           <w:rPr>
-            <w:rStyle w:val="ListLabel91"/>
+            <w:rStyle w:val="ListLabel1"/>
             <w:rFonts w:eastAsia="Times New Roman" w:cs="Times New Roman" w:ascii="Times New Roman" w:hAnsi="Times New Roman"/>
             <w:color w:val="0000FF"/>
             <w:sz w:val="28"/>
@@ -1179,7 +1179,7 @@
       <w:hyperlink r:id="rId6" w:tgtFrame="_blank">
         <w:r>
           <w:rPr>
-            <w:rStyle w:val="ListLabel91"/>
+            <w:rStyle w:val="ListLabel1"/>
             <w:rFonts w:eastAsia="Times New Roman" w:cs="Times New Roman" w:ascii="Times New Roman" w:hAnsi="Times New Roman"/>
             <w:color w:val="0000FF"/>
             <w:sz w:val="28"/>
@@ -1251,7 +1251,7 @@
       <w:hyperlink r:id="rId7" w:tgtFrame="_blank">
         <w:r>
           <w:rPr>
-            <w:rStyle w:val="ListLabel91"/>
+            <w:rStyle w:val="ListLabel1"/>
             <w:rFonts w:eastAsia="Times New Roman" w:cs="Times New Roman" w:ascii="Times New Roman" w:hAnsi="Times New Roman"/>
             <w:color w:val="0000FF"/>
             <w:sz w:val="28"/>
@@ -1273,7 +1273,7 @@
       <w:hyperlink r:id="rId8" w:tgtFrame="_blank">
         <w:r>
           <w:rPr>
-            <w:rStyle w:val="ListLabel91"/>
+            <w:rStyle w:val="ListLabel1"/>
             <w:rFonts w:eastAsia="Times New Roman" w:cs="Times New Roman" w:ascii="Times New Roman" w:hAnsi="Times New Roman"/>
             <w:color w:val="0000FF"/>
             <w:sz w:val="28"/>
@@ -1295,7 +1295,7 @@
       <w:hyperlink r:id="rId9" w:tgtFrame="_blank">
         <w:r>
           <w:rPr>
-            <w:rStyle w:val="ListLabel91"/>
+            <w:rStyle w:val="ListLabel1"/>
             <w:rFonts w:eastAsia="Times New Roman" w:cs="Times New Roman" w:ascii="Times New Roman" w:hAnsi="Times New Roman"/>
             <w:color w:val="0000FF"/>
             <w:sz w:val="28"/>
@@ -1359,7 +1359,7 @@
       <w:hyperlink r:id="rId10" w:tgtFrame="_blank">
         <w:r>
           <w:rPr>
-            <w:rStyle w:val="ListLabel91"/>
+            <w:rStyle w:val="ListLabel1"/>
             <w:rFonts w:eastAsia="Times New Roman" w:cs="Times New Roman" w:ascii="Times New Roman" w:hAnsi="Times New Roman"/>
             <w:color w:val="0000FF"/>
             <w:sz w:val="28"/>
@@ -1427,7 +1427,7 @@
       <w:hyperlink r:id="rId11" w:tgtFrame="_blank">
         <w:r>
           <w:rPr>
-            <w:rStyle w:val="ListLabel91"/>
+            <w:rStyle w:val="ListLabel1"/>
             <w:rFonts w:eastAsia="Times New Roman" w:cs="Times New Roman" w:ascii="Times New Roman" w:hAnsi="Times New Roman"/>
             <w:color w:val="0000FF"/>
             <w:sz w:val="28"/>
@@ -2582,7 +2582,6 @@
     <w:p>
       <w:pPr>
         <w:pStyle w:val="Normal"/>
-        <w:pBdr/>
         <w:spacing w:lineRule="auto" w:line="240" w:before="0" w:after="0"/>
         <w:rPr>
           <w:rFonts w:ascii="Times New Roman" w:hAnsi="Times New Roman" w:eastAsia="Times New Roman" w:cs="Times New Roman"/>
@@ -2667,7 +2666,6 @@
       <w:pPr>
         <w:pStyle w:val="Normal"/>
         <w:keepNext w:val="true"/>
-        <w:pBdr/>
         <w:spacing w:lineRule="auto" w:line="240" w:before="0" w:after="0"/>
         <w:rPr>
           <w:lang w:val="en-US"/>
@@ -2683,7 +2681,6 @@
       <w:pPr>
         <w:pStyle w:val="Normal"/>
         <w:keepNext w:val="true"/>
-        <w:pBdr/>
         <w:spacing w:lineRule="auto" w:line="240" w:before="0" w:after="0"/>
         <w:rPr>
           <w:lang w:val="en-US"/>
@@ -2699,7 +2696,6 @@
       <w:pPr>
         <w:pStyle w:val="Normal"/>
         <w:keepNext w:val="true"/>
-        <w:pBdr/>
         <w:spacing w:lineRule="auto" w:line="240" w:before="0" w:after="0"/>
         <w:rPr>
           <w:lang w:val="en-US"/>
@@ -2715,7 +2711,6 @@
       <w:pPr>
         <w:pStyle w:val="Normal"/>
         <w:keepNext w:val="true"/>
-        <w:pBdr/>
         <w:spacing w:lineRule="auto" w:line="240" w:before="0" w:after="0"/>
         <w:rPr>
           <w:lang w:val="en-US"/>
@@ -2731,22 +2726,20 @@
       <w:pPr>
         <w:pStyle w:val="Normal"/>
         <w:keepNext w:val="true"/>
-        <w:pBdr/>
-        <w:spacing w:lineRule="auto" w:line="240" w:before="0" w:after="0"/>
-        <w:rPr>
-          <w:lang w:val="en-US"/>
-        </w:rPr>
-      </w:pPr>
-      <w:r>
-        <w:rPr>
-          <w:lang w:val="en-US"/>
-        </w:rPr>
-      </w:r>
-    </w:p>
-    <w:p>
-      <w:pPr>
-        <w:pStyle w:val="Normal"/>
-        <w:pBdr/>
+        <w:spacing w:lineRule="auto" w:line="240" w:before="0" w:after="0"/>
+        <w:rPr>
+          <w:lang w:val="en-US"/>
+        </w:rPr>
+      </w:pPr>
+      <w:r>
+        <w:rPr>
+          <w:lang w:val="en-US"/>
+        </w:rPr>
+      </w:r>
+    </w:p>
+    <w:p>
+      <w:pPr>
+        <w:pStyle w:val="Normal"/>
         <w:spacing w:lineRule="auto" w:line="240" w:before="0" w:after="0"/>
         <w:ind w:left="360"/>
         <w:rPr>
@@ -2768,7 +2761,6 @@
     <w:p>
       <w:pPr>
         <w:pStyle w:val="Normal"/>
-        <w:pBdr/>
         <w:spacing w:lineRule="auto" w:line="240" w:before="0" w:after="0"/>
         <w:ind w:left="360"/>
         <w:rPr>
@@ -2790,7 +2782,6 @@
     <w:p>
       <w:pPr>
         <w:pStyle w:val="Normal"/>
-        <w:pBdr/>
         <w:spacing w:lineRule="auto" w:line="240" w:before="0" w:after="0"/>
         <w:ind w:left="360"/>
         <w:rPr>
@@ -2812,7 +2803,6 @@
     <w:p>
       <w:pPr>
         <w:pStyle w:val="Normal"/>
-        <w:pBdr/>
         <w:spacing w:lineRule="auto" w:line="240" w:before="0" w:after="0"/>
         <w:ind w:left="360"/>
         <w:rPr>
@@ -2834,7 +2824,6 @@
     <w:p>
       <w:pPr>
         <w:pStyle w:val="Normal"/>
-        <w:pBdr/>
         <w:spacing w:lineRule="auto" w:line="240" w:before="0" w:after="0"/>
         <w:ind w:left="360"/>
         <w:rPr>
@@ -2856,7 +2845,6 @@
     <w:p>
       <w:pPr>
         <w:pStyle w:val="Normal"/>
-        <w:pBdr/>
         <w:spacing w:lineRule="auto" w:line="240" w:before="0" w:after="0"/>
         <w:ind w:left="360"/>
         <w:rPr>
@@ -2878,7 +2866,6 @@
     <w:p>
       <w:pPr>
         <w:pStyle w:val="Normal"/>
-        <w:pBdr/>
         <w:spacing w:lineRule="auto" w:line="240" w:before="0" w:after="0"/>
         <w:ind w:left="360"/>
         <w:rPr>
@@ -2900,7 +2887,6 @@
     <w:p>
       <w:pPr>
         <w:pStyle w:val="Normal"/>
-        <w:pBdr/>
         <w:spacing w:lineRule="auto" w:line="240" w:before="0" w:after="0"/>
         <w:ind w:left="360"/>
         <w:rPr>
@@ -2922,7 +2908,6 @@
     <w:p>
       <w:pPr>
         <w:pStyle w:val="Normal"/>
-        <w:pBdr/>
         <w:spacing w:lineRule="auto" w:line="240" w:before="0" w:after="0"/>
         <w:ind w:left="360"/>
         <w:rPr>
@@ -2944,7 +2929,6 @@
     <w:p>
       <w:pPr>
         <w:pStyle w:val="Normal"/>
-        <w:pBdr/>
         <w:spacing w:lineRule="auto" w:line="240" w:before="0" w:after="0"/>
         <w:ind w:left="360"/>
         <w:rPr>
@@ -2966,7 +2950,6 @@
     <w:p>
       <w:pPr>
         <w:pStyle w:val="Normal"/>
-        <w:pBdr/>
         <w:spacing w:lineRule="auto" w:line="240" w:before="0" w:after="0"/>
         <w:ind w:left="360"/>
         <w:rPr>
@@ -2988,7 +2971,6 @@
     <w:p>
       <w:pPr>
         <w:pStyle w:val="Normal"/>
-        <w:pBdr/>
         <w:spacing w:lineRule="auto" w:line="240" w:before="0" w:after="0"/>
         <w:ind w:left="360"/>
         <w:rPr>
@@ -3010,7 +2992,6 @@
     <w:p>
       <w:pPr>
         <w:pStyle w:val="Normal"/>
-        <w:pBdr/>
         <w:spacing w:lineRule="auto" w:line="240" w:before="0" w:after="0"/>
         <w:ind w:left="360"/>
         <w:rPr>
@@ -3032,7 +3013,6 @@
     <w:p>
       <w:pPr>
         <w:pStyle w:val="Normal"/>
-        <w:pBdr/>
         <w:spacing w:lineRule="auto" w:line="240" w:before="0" w:after="0"/>
         <w:ind w:left="360"/>
         <w:rPr>
@@ -3054,7 +3034,6 @@
     <w:p>
       <w:pPr>
         <w:pStyle w:val="Normal"/>
-        <w:pBdr/>
         <w:spacing w:lineRule="auto" w:line="240" w:before="0" w:after="0"/>
         <w:ind w:left="360"/>
         <w:rPr>
@@ -3076,7 +3055,6 @@
     <w:p>
       <w:pPr>
         <w:pStyle w:val="Normal"/>
-        <w:pBdr/>
         <w:spacing w:lineRule="auto" w:line="240" w:before="0" w:after="0"/>
         <w:ind w:left="360"/>
         <w:rPr>
@@ -3098,7 +3076,6 @@
     <w:p>
       <w:pPr>
         <w:pStyle w:val="Normal"/>
-        <w:pBdr/>
         <w:spacing w:lineRule="auto" w:line="240" w:before="0" w:after="0"/>
         <w:ind w:left="360"/>
         <w:rPr>
@@ -3120,7 +3097,6 @@
     <w:p>
       <w:pPr>
         <w:pStyle w:val="Normal"/>
-        <w:pBdr/>
         <w:spacing w:lineRule="auto" w:line="240" w:before="0" w:after="0"/>
         <w:ind w:left="360"/>
         <w:rPr>
@@ -3142,7 +3118,6 @@
     <w:p>
       <w:pPr>
         <w:pStyle w:val="Normal"/>
-        <w:pBdr/>
         <w:spacing w:lineRule="auto" w:line="240" w:before="0" w:after="0"/>
         <w:ind w:left="360"/>
         <w:rPr>
@@ -3164,7 +3139,6 @@
     <w:p>
       <w:pPr>
         <w:pStyle w:val="Normal"/>
-        <w:pBdr/>
         <w:spacing w:lineRule="auto" w:line="240" w:before="0" w:after="0"/>
         <w:ind w:left="360"/>
         <w:rPr>
@@ -3186,7 +3160,6 @@
     <w:p>
       <w:pPr>
         <w:pStyle w:val="Normal"/>
-        <w:pBdr/>
         <w:spacing w:lineRule="auto" w:line="240" w:before="0" w:after="0"/>
         <w:ind w:left="360"/>
         <w:rPr>
@@ -3208,7 +3181,6 @@
     <w:p>
       <w:pPr>
         <w:pStyle w:val="Normal"/>
-        <w:pBdr/>
         <w:spacing w:lineRule="auto" w:line="240" w:before="0" w:after="0"/>
         <w:ind w:left="360"/>
         <w:rPr>
@@ -3230,7 +3202,6 @@
     <w:p>
       <w:pPr>
         <w:pStyle w:val="Normal"/>
-        <w:pBdr/>
         <w:spacing w:lineRule="auto" w:line="240" w:before="0" w:after="0"/>
         <w:ind w:left="360"/>
         <w:rPr>
@@ -3252,7 +3223,6 @@
     <w:p>
       <w:pPr>
         <w:pStyle w:val="Normal"/>
-        <w:pBdr/>
         <w:spacing w:lineRule="auto" w:line="240" w:before="0" w:after="0"/>
         <w:ind w:left="360"/>
         <w:rPr>
@@ -3274,7 +3244,6 @@
     <w:p>
       <w:pPr>
         <w:pStyle w:val="Normal"/>
-        <w:pBdr/>
         <w:spacing w:lineRule="auto" w:line="240" w:before="0" w:after="0"/>
         <w:ind w:left="360"/>
         <w:rPr>
@@ -3296,7 +3265,6 @@
     <w:p>
       <w:pPr>
         <w:pStyle w:val="Normal"/>
-        <w:pBdr/>
         <w:spacing w:lineRule="auto" w:line="240" w:before="0" w:after="0"/>
         <w:ind w:left="360"/>
         <w:rPr>
@@ -3318,7 +3286,6 @@
     <w:p>
       <w:pPr>
         <w:pStyle w:val="Normal"/>
-        <w:pBdr/>
         <w:spacing w:lineRule="auto" w:line="240" w:before="0" w:after="0"/>
         <w:ind w:left="360"/>
         <w:rPr>
@@ -3340,7 +3307,6 @@
     <w:p>
       <w:pPr>
         <w:pStyle w:val="Normal"/>
-        <w:pBdr/>
         <w:spacing w:lineRule="auto" w:line="240" w:before="0" w:after="0"/>
         <w:ind w:left="360"/>
         <w:rPr>
@@ -3362,7 +3328,6 @@
     <w:p>
       <w:pPr>
         <w:pStyle w:val="Normal"/>
-        <w:pBdr/>
         <w:spacing w:lineRule="auto" w:line="240" w:before="0" w:after="0"/>
         <w:ind w:left="360"/>
         <w:rPr>
@@ -3384,7 +3349,6 @@
     <w:p>
       <w:pPr>
         <w:pStyle w:val="Normal"/>
-        <w:pBdr/>
         <w:spacing w:lineRule="auto" w:line="240" w:before="0" w:after="0"/>
         <w:ind w:left="360"/>
         <w:rPr>
@@ -3406,7 +3370,6 @@
     <w:p>
       <w:pPr>
         <w:pStyle w:val="Normal"/>
-        <w:pBdr/>
         <w:spacing w:lineRule="auto" w:line="240" w:before="0" w:after="0"/>
         <w:ind w:left="360"/>
         <w:rPr>
@@ -3428,7 +3391,6 @@
     <w:p>
       <w:pPr>
         <w:pStyle w:val="Normal"/>
-        <w:pBdr/>
         <w:spacing w:lineRule="auto" w:line="240" w:before="0" w:after="0"/>
         <w:ind w:left="360"/>
         <w:rPr>
@@ -3450,7 +3412,6 @@
     <w:p>
       <w:pPr>
         <w:pStyle w:val="Normal"/>
-        <w:pBdr/>
         <w:spacing w:lineRule="auto" w:line="240" w:before="0" w:after="0"/>
         <w:ind w:left="360"/>
         <w:rPr>
@@ -3472,7 +3433,6 @@
     <w:p>
       <w:pPr>
         <w:pStyle w:val="Normal"/>
-        <w:pBdr/>
         <w:spacing w:lineRule="auto" w:line="240" w:before="0" w:after="0"/>
         <w:ind w:left="360"/>
         <w:rPr>
@@ -3494,7 +3454,6 @@
     <w:p>
       <w:pPr>
         <w:pStyle w:val="Normal"/>
-        <w:pBdr/>
         <w:spacing w:lineRule="auto" w:line="240" w:before="0" w:after="0"/>
         <w:ind w:left="360"/>
         <w:rPr>
@@ -3516,7 +3475,6 @@
     <w:p>
       <w:pPr>
         <w:pStyle w:val="Normal"/>
-        <w:pBdr/>
         <w:spacing w:lineRule="auto" w:line="240" w:before="0" w:after="0"/>
         <w:rPr>
           <w:color w:val="000000"/>
@@ -3569,7 +3527,6 @@
     <w:p>
       <w:pPr>
         <w:pStyle w:val="Normal"/>
-        <w:pBdr/>
         <w:spacing w:lineRule="auto" w:line="240" w:before="0" w:after="0"/>
         <w:rPr>
           <w:color w:val="000000"/>
@@ -3622,7 +3579,6 @@
     <w:p>
       <w:pPr>
         <w:pStyle w:val="Normal"/>
-        <w:pBdr/>
         <w:spacing w:lineRule="auto" w:line="240" w:before="0" w:after="0"/>
         <w:ind w:left="360"/>
         <w:rPr>
@@ -3644,7 +3600,6 @@
     <w:p>
       <w:pPr>
         <w:pStyle w:val="Normal"/>
-        <w:pBdr/>
         <w:spacing w:lineRule="auto" w:line="240" w:before="0" w:after="0"/>
         <w:ind w:left="360"/>
         <w:rPr>
@@ -3666,7 +3621,6 @@
     <w:p>
       <w:pPr>
         <w:pStyle w:val="Normal"/>
-        <w:pBdr/>
         <w:spacing w:lineRule="auto" w:line="240" w:before="0" w:after="0"/>
         <w:ind w:left="360"/>
         <w:rPr>
@@ -3688,7 +3642,6 @@
     <w:p>
       <w:pPr>
         <w:pStyle w:val="Normal"/>
-        <w:pBdr/>
         <w:spacing w:lineRule="auto" w:line="240" w:before="0" w:after="0"/>
         <w:ind w:left="360"/>
         <w:rPr>
@@ -3710,7 +3663,6 @@
     <w:p>
       <w:pPr>
         <w:pStyle w:val="Normal"/>
-        <w:pBdr/>
         <w:spacing w:lineRule="auto" w:line="240" w:before="0" w:after="0"/>
         <w:ind w:left="360"/>
         <w:rPr>
@@ -3732,7 +3684,6 @@
     <w:p>
       <w:pPr>
         <w:pStyle w:val="Normal"/>
-        <w:pBdr/>
         <w:spacing w:lineRule="auto" w:line="240" w:before="0" w:after="0"/>
         <w:rPr>
           <w:color w:val="000000"/>
@@ -3785,7 +3736,6 @@
     <w:p>
       <w:pPr>
         <w:pStyle w:val="Normal"/>
-        <w:pBdr/>
         <w:spacing w:lineRule="auto" w:line="240" w:before="0" w:after="0"/>
         <w:ind w:left="360"/>
         <w:rPr>
@@ -3807,7 +3757,6 @@
     <w:p>
       <w:pPr>
         <w:pStyle w:val="Normal"/>
-        <w:pBdr/>
         <w:spacing w:lineRule="auto" w:line="240" w:before="0" w:after="0"/>
         <w:ind w:left="360"/>
         <w:rPr>
@@ -3831,7 +3780,6 @@
     <w:p>
       <w:pPr>
         <w:pStyle w:val="Normal"/>
-        <w:pBdr/>
         <w:spacing w:lineRule="auto" w:line="240" w:before="0" w:after="0"/>
         <w:ind w:left="360"/>
         <w:rPr>
@@ -3886,7 +3834,6 @@
     <w:p>
       <w:pPr>
         <w:pStyle w:val="Normal"/>
-        <w:pBdr/>
         <w:spacing w:lineRule="auto" w:line="240" w:before="0" w:after="0"/>
         <w:ind w:left="360"/>
         <w:rPr>
@@ -3910,7 +3857,6 @@
     <w:p>
       <w:pPr>
         <w:pStyle w:val="Normal"/>
-        <w:pBdr/>
         <w:spacing w:lineRule="auto" w:line="240" w:before="0" w:after="0"/>
         <w:ind w:left="360"/>
         <w:rPr>
@@ -3934,7 +3880,6 @@
     <w:p>
       <w:pPr>
         <w:pStyle w:val="Normal"/>
-        <w:pBdr/>
         <w:spacing w:lineRule="auto" w:line="240" w:before="0" w:after="0"/>
         <w:ind w:left="360"/>
         <w:rPr>
@@ -3958,7 +3903,6 @@
     <w:p>
       <w:pPr>
         <w:pStyle w:val="Normal"/>
-        <w:pBdr/>
         <w:spacing w:lineRule="auto" w:line="240" w:before="0" w:after="0"/>
         <w:ind w:left="360"/>
         <w:rPr>
@@ -3982,7 +3926,6 @@
     <w:p>
       <w:pPr>
         <w:pStyle w:val="Normal"/>
-        <w:pBdr/>
         <w:spacing w:lineRule="auto" w:line="240" w:before="0" w:after="0"/>
         <w:ind w:left="360"/>
         <w:rPr>
@@ -4037,7 +3980,6 @@
     <w:p>
       <w:pPr>
         <w:pStyle w:val="Normal"/>
-        <w:pBdr/>
         <w:spacing w:lineRule="auto" w:line="240" w:before="0" w:after="0"/>
         <w:ind w:left="360"/>
         <w:rPr>
@@ -4061,7 +4003,6 @@
     <w:p>
       <w:pPr>
         <w:pStyle w:val="Normal"/>
-        <w:pBdr/>
         <w:spacing w:lineRule="auto" w:line="240" w:before="0" w:after="0"/>
         <w:ind w:left="360"/>
         <w:jc w:val="center"/>
@@ -4131,7 +4072,6 @@
     <w:p>
       <w:pPr>
         <w:pStyle w:val="Normal"/>
-        <w:pBdr/>
         <w:spacing w:lineRule="auto" w:line="240" w:before="0" w:after="0"/>
         <w:ind w:left="360"/>
         <w:rPr>
@@ -4155,7 +4095,6 @@
     <w:p>
       <w:pPr>
         <w:pStyle w:val="Normal"/>
-        <w:pBdr/>
         <w:spacing w:lineRule="auto" w:line="240" w:before="0" w:after="0"/>
         <w:ind w:left="360"/>
         <w:rPr>
@@ -4179,7 +4118,6 @@
     <w:p>
       <w:pPr>
         <w:pStyle w:val="Normal"/>
-        <w:pBdr/>
         <w:spacing w:lineRule="auto" w:line="240" w:before="0" w:after="0"/>
         <w:ind w:left="360"/>
         <w:rPr>
@@ -4203,7 +4141,6 @@
     <w:p>
       <w:pPr>
         <w:pStyle w:val="Normal"/>
-        <w:pBdr/>
         <w:spacing w:lineRule="auto" w:line="240" w:before="0" w:after="0"/>
         <w:rPr>
           <w:sz w:val="24"/>
@@ -4223,24 +4160,22 @@
     <w:p>
       <w:pPr>
         <w:pStyle w:val="Normal"/>
-        <w:pBdr/>
-        <w:spacing w:lineRule="auto" w:line="240" w:before="0" w:after="0"/>
-        <w:rPr>
-          <w:sz w:val="24"/>
-          <w:szCs w:val="24"/>
-        </w:rPr>
-      </w:pPr>
-      <w:r>
-        <w:rPr>
-          <w:sz w:val="24"/>
-          <w:szCs w:val="24"/>
-        </w:rPr>
-      </w:r>
-    </w:p>
-    <w:p>
-      <w:pPr>
-        <w:pStyle w:val="Normal"/>
-        <w:pBdr/>
+        <w:spacing w:lineRule="auto" w:line="240" w:before="0" w:after="0"/>
+        <w:rPr>
+          <w:sz w:val="24"/>
+          <w:szCs w:val="24"/>
+        </w:rPr>
+      </w:pPr>
+      <w:r>
+        <w:rPr>
+          <w:sz w:val="24"/>
+          <w:szCs w:val="24"/>
+        </w:rPr>
+      </w:r>
+    </w:p>
+    <w:p>
+      <w:pPr>
+        <w:pStyle w:val="Normal"/>
         <w:spacing w:lineRule="auto" w:line="240" w:before="0" w:after="0"/>
         <w:ind w:left="360"/>
         <w:rPr>
@@ -4260,7 +4195,6 @@
     <w:p>
       <w:pPr>
         <w:pStyle w:val="Normal"/>
-        <w:pBdr/>
         <w:spacing w:lineRule="auto" w:line="240" w:before="0" w:after="0"/>
         <w:rPr>
           <w:rFonts w:ascii="Times New Roman" w:hAnsi="Times New Roman" w:cs="Times New Roman"/>
@@ -5586,24 +5520,22 @@
       <w:pPr>
         <w:pStyle w:val="Normal"/>
         <w:spacing w:lineRule="auto" w:line="240" w:before="0" w:after="0"/>
-        <w:rPr>
-          <w:rFonts w:ascii="Times New Roman" w:hAnsi="Times New Roman" w:cs="Times New Roman"/>
-          <w:b/>
-          <w:bCs/>
-          <w:sz w:val="24"/>
-          <w:szCs w:val="24"/>
-        </w:rPr>
-      </w:pPr>
-      <w:r>
-        <w:rPr>
-          <w:rFonts w:cs="Times New Roman" w:ascii="Times New Roman" w:hAnsi="Times New Roman"/>
-          <w:b/>
-          <w:bCs/>
-          <w:sz w:val="24"/>
-          <w:szCs w:val="24"/>
-        </w:rPr>
-        <w:t>Посилання на файл коду в pull-request</w:t>
-      </w:r>
+        <w:jc w:val="center"/>
+        <w:rPr/>
+      </w:pPr>
+      <w:hyperlink r:id="rId21">
+        <w:r>
+          <w:rPr>
+            <w:rStyle w:val="Hyperlink"/>
+            <w:rFonts w:cs="Times New Roman" w:ascii="Times New Roman" w:hAnsi="Times New Roman"/>
+            <w:b/>
+            <w:bCs/>
+            <w:sz w:val="24"/>
+            <w:szCs w:val="24"/>
+          </w:rPr>
+          <w:t>Посилання на файл коду в pull-request</w:t>
+        </w:r>
+      </w:hyperlink>
     </w:p>
     <w:p>
       <w:pPr>
@@ -6892,22 +6824,22 @@
       <w:pPr>
         <w:pStyle w:val="Normal"/>
         <w:spacing w:lineRule="auto" w:line="240" w:before="0" w:after="0"/>
-        <w:rPr>
-          <w:rFonts w:ascii="Times New Roman" w:hAnsi="Times New Roman" w:cs="Times New Roman"/>
-          <w:sz w:val="24"/>
-          <w:szCs w:val="24"/>
-        </w:rPr>
-      </w:pPr>
-      <w:r>
-        <w:rPr>
-          <w:rFonts w:cs="Times New Roman" w:ascii="Times New Roman" w:hAnsi="Times New Roman"/>
-          <w:b/>
-          <w:bCs/>
-          <w:sz w:val="24"/>
-          <w:szCs w:val="24"/>
-        </w:rPr>
-        <w:t>Посилання на файл коду в pull-request:</w:t>
-      </w:r>
+        <w:jc w:val="center"/>
+        <w:rPr/>
+      </w:pPr>
+      <w:hyperlink r:id="rId22">
+        <w:r>
+          <w:rPr>
+            <w:rStyle w:val="Hyperlink"/>
+            <w:rFonts w:cs="Times New Roman" w:ascii="Times New Roman" w:hAnsi="Times New Roman"/>
+            <w:b/>
+            <w:bCs/>
+            <w:sz w:val="24"/>
+            <w:szCs w:val="24"/>
+          </w:rPr>
+          <w:t>Посилання на файл коду в pull-request</w:t>
+        </w:r>
+      </w:hyperlink>
     </w:p>
     <w:p>
       <w:pPr>
@@ -13057,23 +12989,22 @@
       <w:pPr>
         <w:pStyle w:val="Normal"/>
         <w:spacing w:lineRule="auto" w:line="240" w:before="0" w:after="0"/>
-        <w:rPr>
-          <w:rFonts w:ascii="Times New Roman" w:hAnsi="Times New Roman" w:cs="Times New Roman"/>
-          <w:sz w:val="24"/>
-          <w:szCs w:val="24"/>
-          <w:lang w:val="en-US"/>
-        </w:rPr>
-      </w:pPr>
-      <w:r>
-        <w:rPr>
-          <w:rFonts w:cs="Times New Roman" w:ascii="Times New Roman" w:hAnsi="Times New Roman"/>
-          <w:b/>
-          <w:bCs/>
-          <w:sz w:val="24"/>
-          <w:szCs w:val="24"/>
-        </w:rPr>
-        <w:t>Посилання на файл коду в pull-request:</w:t>
-      </w:r>
+        <w:jc w:val="center"/>
+        <w:rPr/>
+      </w:pPr>
+      <w:hyperlink r:id="rId23">
+        <w:r>
+          <w:rPr>
+            <w:rStyle w:val="Hyperlink"/>
+            <w:rFonts w:cs="Times New Roman" w:ascii="Times New Roman" w:hAnsi="Times New Roman"/>
+            <w:b/>
+            <w:bCs/>
+            <w:sz w:val="24"/>
+            <w:szCs w:val="24"/>
+          </w:rPr>
+          <w:t>Посилання на файл коду в pull-request</w:t>
+        </w:r>
+      </w:hyperlink>
     </w:p>
     <w:p>
       <w:pPr>
@@ -13935,23 +13866,22 @@
       <w:pPr>
         <w:pStyle w:val="Normal"/>
         <w:spacing w:lineRule="auto" w:line="240" w:before="0" w:after="0"/>
-        <w:rPr>
-          <w:rFonts w:ascii="Times New Roman" w:hAnsi="Times New Roman" w:cs="Times New Roman"/>
-          <w:sz w:val="24"/>
-          <w:szCs w:val="24"/>
-          <w:lang w:val="en-US"/>
-        </w:rPr>
-      </w:pPr>
-      <w:r>
-        <w:rPr>
-          <w:rFonts w:cs="Times New Roman" w:ascii="Times New Roman" w:hAnsi="Times New Roman"/>
-          <w:b/>
-          <w:bCs/>
-          <w:sz w:val="24"/>
-          <w:szCs w:val="24"/>
-        </w:rPr>
-        <w:t>Посилання на файл коду в pull-request:</w:t>
-      </w:r>
+        <w:jc w:val="center"/>
+        <w:rPr/>
+      </w:pPr>
+      <w:hyperlink r:id="rId24">
+        <w:r>
+          <w:rPr>
+            <w:rStyle w:val="Hyperlink"/>
+            <w:rFonts w:cs="Times New Roman" w:ascii="Times New Roman" w:hAnsi="Times New Roman"/>
+            <w:b/>
+            <w:bCs/>
+            <w:sz w:val="24"/>
+            <w:szCs w:val="24"/>
+          </w:rPr>
+          <w:t>Посилання на файл коду в pull-request</w:t>
+        </w:r>
+      </w:hyperlink>
     </w:p>
     <w:p>
       <w:pPr>
@@ -15117,25 +15047,22 @@
       <w:pPr>
         <w:pStyle w:val="Normal"/>
         <w:spacing w:lineRule="auto" w:line="240" w:before="0" w:after="0"/>
-        <w:rPr>
-          <w:rFonts w:ascii="Times New Roman" w:hAnsi="Times New Roman" w:cs="Times New Roman"/>
-          <w:b/>
-          <w:bCs/>
-          <w:sz w:val="24"/>
-          <w:szCs w:val="24"/>
-          <w:lang w:val="en-US"/>
-        </w:rPr>
-      </w:pPr>
-      <w:r>
-        <w:rPr>
-          <w:rFonts w:cs="Times New Roman" w:ascii="Times New Roman" w:hAnsi="Times New Roman"/>
-          <w:b/>
-          <w:bCs/>
-          <w:sz w:val="24"/>
-          <w:szCs w:val="24"/>
-        </w:rPr>
-        <w:t>Посилання на файл коду в pull-request:</w:t>
-      </w:r>
+        <w:jc w:val="center"/>
+        <w:rPr/>
+      </w:pPr>
+      <w:hyperlink r:id="rId25">
+        <w:r>
+          <w:rPr>
+            <w:rStyle w:val="Hyperlink"/>
+            <w:rFonts w:cs="Times New Roman" w:ascii="Times New Roman" w:hAnsi="Times New Roman"/>
+            <w:b/>
+            <w:bCs/>
+            <w:sz w:val="24"/>
+            <w:szCs w:val="24"/>
+          </w:rPr>
+          <w:t>Посилання на файл коду в pull-request</w:t>
+        </w:r>
+      </w:hyperlink>
     </w:p>
     <w:p>
       <w:pPr>
@@ -16070,25 +15997,22 @@
       <w:pPr>
         <w:pStyle w:val="Normal"/>
         <w:spacing w:lineRule="auto" w:line="240" w:before="0" w:after="0"/>
-        <w:rPr>
-          <w:rFonts w:ascii="Times New Roman" w:hAnsi="Times New Roman" w:cs="Times New Roman"/>
-          <w:b/>
-          <w:bCs/>
-          <w:sz w:val="24"/>
-          <w:szCs w:val="24"/>
-          <w:lang w:val="en-US"/>
-        </w:rPr>
-      </w:pPr>
-      <w:r>
-        <w:rPr>
-          <w:rFonts w:cs="Times New Roman" w:ascii="Times New Roman" w:hAnsi="Times New Roman"/>
-          <w:b/>
-          <w:bCs/>
-          <w:sz w:val="24"/>
-          <w:szCs w:val="24"/>
-        </w:rPr>
-        <w:t>Посилання на файл коду в pull-request:</w:t>
-      </w:r>
+        <w:jc w:val="center"/>
+        <w:rPr/>
+      </w:pPr>
+      <w:hyperlink r:id="rId26">
+        <w:r>
+          <w:rPr>
+            <w:rStyle w:val="Hyperlink"/>
+            <w:rFonts w:cs="Times New Roman" w:ascii="Times New Roman" w:hAnsi="Times New Roman"/>
+            <w:b/>
+            <w:bCs/>
+            <w:sz w:val="24"/>
+            <w:szCs w:val="24"/>
+          </w:rPr>
+          <w:t>Посилання на файл коду в pull-request</w:t>
+        </w:r>
+      </w:hyperlink>
     </w:p>
     <w:p>
       <w:pPr>
@@ -16197,7 +16121,7 @@
                     </pic:cNvPicPr>
                   </pic:nvPicPr>
                   <pic:blipFill>
-                    <a:blip r:embed="rId21"/>
+                    <a:blip r:embed="rId27"/>
                     <a:stretch>
                       <a:fillRect/>
                     </a:stretch>
@@ -16426,7 +16350,7 @@
                     </pic:cNvPicPr>
                   </pic:nvPicPr>
                   <pic:blipFill>
-                    <a:blip r:embed="rId22"/>
+                    <a:blip r:embed="rId28"/>
                     <a:stretch>
                       <a:fillRect/>
                     </a:stretch>
@@ -16610,7 +16534,7 @@
                     </pic:cNvPicPr>
                   </pic:nvPicPr>
                   <pic:blipFill>
-                    <a:blip r:embed="rId23"/>
+                    <a:blip r:embed="rId29"/>
                     <a:stretch>
                       <a:fillRect/>
                     </a:stretch>
@@ -16682,7 +16606,7 @@
                     </pic:cNvPicPr>
                   </pic:nvPicPr>
                   <pic:blipFill>
-                    <a:blip r:embed="rId24"/>
+                    <a:blip r:embed="rId30"/>
                     <a:stretch>
                       <a:fillRect/>
                     </a:stretch>
@@ -16899,7 +16823,7 @@
                     </pic:cNvPicPr>
                   </pic:nvPicPr>
                   <pic:blipFill>
-                    <a:blip r:embed="rId25"/>
+                    <a:blip r:embed="rId31"/>
                     <a:stretch>
                       <a:fillRect/>
                     </a:stretch>
@@ -17076,7 +17000,7 @@
                     </pic:cNvPicPr>
                   </pic:nvPicPr>
                   <pic:blipFill>
-                    <a:blip r:embed="rId26"/>
+                    <a:blip r:embed="rId32"/>
                     <a:stretch>
                       <a:fillRect/>
                     </a:stretch>
@@ -17240,7 +17164,7 @@
                     </pic:cNvPicPr>
                   </pic:nvPicPr>
                   <pic:blipFill>
-                    <a:blip r:embed="rId27"/>
+                    <a:blip r:embed="rId33"/>
                     <a:stretch>
                       <a:fillRect/>
                     </a:stretch>
@@ -17397,7 +17321,7 @@
                     </pic:cNvPicPr>
                   </pic:nvPicPr>
                   <pic:blipFill>
-                    <a:blip r:embed="rId28"/>
+                    <a:blip r:embed="rId34"/>
                     <a:stretch>
                       <a:fillRect/>
                     </a:stretch>
@@ -17437,7 +17361,7 @@
                     </pic:cNvPicPr>
                   </pic:nvPicPr>
                   <pic:blipFill>
-                    <a:blip r:embed="rId29"/>
+                    <a:blip r:embed="rId35"/>
                     <a:stretch>
                       <a:fillRect/>
                     </a:stretch>
@@ -17523,7 +17447,7 @@
                     </pic:cNvPicPr>
                   </pic:nvPicPr>
                   <pic:blipFill>
-                    <a:blip r:embed="rId30"/>
+                    <a:blip r:embed="rId36"/>
                     <a:stretch>
                       <a:fillRect/>
                     </a:stretch>
@@ -17951,6 +17875,7 @@
     <w:rsid w:val="0014723e"/>
     <w:pPr>
       <w:widowControl/>
+      <w:suppressAutoHyphens w:val="true"/>
       <w:bidi w:val="0"/>
       <w:spacing w:lineRule="auto" w:line="276" w:before="0" w:after="200"/>
       <w:jc w:val="left"/>
@@ -17961,7 +17886,7 @@
       <w:kern w:val="0"/>
       <w:sz w:val="22"/>
       <w:szCs w:val="22"/>
-      <w:lang w:eastAsia="uk-UA" w:val="uk-UA" w:bidi="ar-SA"/>
+      <w:lang w:val="uk-UA" w:eastAsia="uk-UA" w:bidi="ar-SA"/>
     </w:rPr>
   </w:style>
   <w:style w:type="paragraph" w:styleId="Heading1">
@@ -18659,7 +18584,7 @@
       <w:kern w:val="0"/>
       <w:sz w:val="22"/>
       <w:szCs w:val="22"/>
-      <w:lang w:eastAsia="zh-CN" w:bidi="hi-IN" w:val="uk-UA"/>
+      <w:lang w:val="uk-UA" w:eastAsia="zh-CN" w:bidi="hi-IN"/>
     </w:rPr>
   </w:style>
   <w:style w:type="paragraph" w:styleId="HTMLPreformatted">

</xml_diff>